<commit_message>
Nueva regla CIT-008: 'et al.' no permitido con 1 o 2 autores (APA 7)
</commit_message>
<xml_diff>
--- a/tests/sample_citas.docx
+++ b/tests/sample_citas.docx
@@ -35,6 +35,15 @@
       </w:pPr>
       <w:r>
         <w:t>La evidencia es contradictoria (Ramos, Soto, y Vega, 2019).</w:t>
+      </w:r>
+    </w:p>
+    <w:p>
+      <w:pPr>
+        <w:ind w:firstLine="720"/>
+        <w:jc w:val="left"/>
+      </w:pPr>
+      <w:r>
+        <w:t>Diversos estudios lo confirman (Perez et al., 2023) en el mismo sentido.</w:t>
       </w:r>
     </w:p>
     <w:p>
@@ -179,6 +188,19 @@
           <w:sz w:val="24"/>
         </w:rPr>
         <w:t>Molina, R. (2019). Competencias digitales en la educacion. Universidad Central.</w:t>
+      </w:r>
+    </w:p>
+    <w:p>
+      <w:pPr>
+        <w:spacing w:line="480" w:lineRule="auto"/>
+        <w:ind w:left="720" w:hanging="720"/>
+      </w:pPr>
+      <w:r>
+        <w:rPr>
+          <w:rFonts w:ascii="Times New Roman" w:hAnsi="Times New Roman"/>
+          <w:sz w:val="24"/>
+        </w:rPr>
+        <w:t>Perez, J., y Gomez, M. (2023). Analisis de la calidad educativa. Editorial Sur.</w:t>
       </w:r>
     </w:p>
     <w:sectPr>

</xml_diff>